<commit_message>
Spec 005 implemented and iterated
can now change the flow of the steps
</commit_message>
<xml_diff>
--- a/docs/requirements.docx
+++ b/docs/requirements.docx
@@ -652,6 +652,12 @@
                 <w:lang w:val="nl-NL"/>
               </w:rPr>
             </w:pPr>
+            <w:r>
+              <w:rPr>
+                <w:lang w:val="nl-NL"/>
+              </w:rPr>
+              <w:t>Ja</w:t>
+            </w:r>
           </w:p>
         </w:tc>
       </w:tr>
@@ -720,6 +726,12 @@
                 <w:lang w:val="nl-NL"/>
               </w:rPr>
             </w:pPr>
+            <w:r>
+              <w:rPr>
+                <w:lang w:val="nl-NL"/>
+              </w:rPr>
+              <w:t>Ja</w:t>
+            </w:r>
           </w:p>
         </w:tc>
       </w:tr>
@@ -924,6 +936,12 @@
                 <w:lang w:val="nl-NL"/>
               </w:rPr>
             </w:pPr>
+            <w:r>
+              <w:rPr>
+                <w:lang w:val="nl-NL"/>
+              </w:rPr>
+              <w:t>Ja</w:t>
+            </w:r>
           </w:p>
         </w:tc>
       </w:tr>

</xml_diff>

<commit_message>
Spec 001 e2e tests
</commit_message>
<xml_diff>
--- a/docs/requirements.docx
+++ b/docs/requirements.docx
@@ -800,6 +800,12 @@
                 <w:lang w:val="nl-NL"/>
               </w:rPr>
             </w:pPr>
+            <w:r>
+              <w:rPr>
+                <w:lang w:val="nl-NL"/>
+              </w:rPr>
+              <w:t>Ja</w:t>
+            </w:r>
           </w:p>
         </w:tc>
       </w:tr>

</xml_diff>